<commit_message>
docs(figures): regenerate Figure 14 without misleading long-post F1=1.00
The Figure 14 image (docs/Sem_4/figures/fig14_sentiment_results.png)
was the last place still showing 'Long posts (>=512 tok) — 1.00' as a
bar. Redrawn as a 2-panel chart:

- Left panel  — Macro-F1 for the two buckets where F1 is meaningful
                (Overall n=200, Short-to-medium <512 tok n=193). Bars
                use the real OOF numbers 0.63/0.76 and 0.64/0.76.
- Right panel — Long-post bucket (>=512 tok, n=7, all negative-class)
                rendered as raw 'posts classified correctly / 7':
                RoBERTa 5/7 vs ModernBERT 7/7.

Also fixed the abstract-sheet narrative in build_final_report.py
that still said '(and 0.28 to 1.00 on long posts)'; now says
'(and 5/7 to 7/7 correct on >=512-tok long posts)'.

Rebuilt LaTeX PDF and DOCX so both embed the new figure.
</commit_message>
<xml_diff>
--- a/docs/Sem_4/final/FINAL_REPORT_VishalSingh_2020AA05641.docx
+++ b/docs/Sem_4/final/FINAL_REPORT_VishalSingh_2020AA05641.docx
@@ -1572,7 +1572,7 @@
           <w:i w:val="0"/>
           <w:sz w:val="24"/>
         </w:rPr>
-        <w:t>Public social media is now a primary real-time channel for retail customer voice, yet fake and low-credibility posts contaminate any aggregate consumed without filtering. This dissertation designs, builds, and evaluates Retail Sentiment Intelligence (RSI), a complete offline-first prototype that converts a noisy public Reddit stream into a structured, aspect-tagged, trust-weighted brand-health feed. Posts from 25 curated retail communities are ingested, de-duplicated, and assigned a 0–1 trust score combining metadata heuristics, near-duplicate detection, and credibility checks. Trusted posts are classified for sentiment by a domain fine-tuned ModernBERT encoder, tagged with aspects by a zero-shot NLI classifier over an eight-category taxonomy, and — when an image is attached — captioned by a multi-pass, anti-hallucination Gemma 3 4B pipeline. Sentiment macro-F1 improved from 0.6272 to 0.7642 (and 0.28 to 1.00 on long posts); vision hallucination fell from 50% to 0%. A React/FastAPI dashboard surfaces results across eight surfaces including a live alert feed, a human-in-the-loop review queue, a post-lifecycle board, and competitor insights. The report documents the full lifecycle: literature survey, design, implementation, honest cross-validated evaluation, limitations, and recommendations.</w:t>
+        <w:t>Public social media is now a primary real-time channel for retail customer voice, yet fake and low-credibility posts contaminate any aggregate consumed without filtering. This dissertation designs, builds, and evaluates Retail Sentiment Intelligence (RSI), a complete offline-first prototype that converts a noisy public Reddit stream into a structured, aspect-tagged, trust-weighted brand-health feed. Posts from 25 curated retail communities are ingested, de-duplicated, and assigned a 0–1 trust score combining metadata heuristics, near-duplicate detection, and credibility checks. Trusted posts are classified for sentiment by a domain fine-tuned ModernBERT encoder, tagged with aspects by a zero-shot NLI classifier over an eight-category taxonomy, and — when an image is attached — captioned by a multi-pass, anti-hallucination Gemma 3 4B pipeline. Sentiment macro-F1 improved from 0.6272 to 0.7642 (and 5/7 to 7/7 correct on ≥512-tok long posts); vision hallucination fell from 50% to 0%. A React/FastAPI dashboard surfaces results across eight surfaces including a live alert feed, a human-in-the-loop review queue, a post-lifecycle board, and competitor insights. The report documents the full lifecycle: literature survey, design, implementation, honest cross-validated evaluation, limitations, and recommendations.</w:t>
       </w:r>
     </w:p>
     <w:tbl>
@@ -2821,7 +2821,7 @@
           <w:i w:val="0"/>
           <w:sz w:val="24"/>
         </w:rPr>
-        <w:t>Public social media is now a primary real-time channel for retail customer voice, yet fake and low-credibility posts contaminate any aggregate consumed without filtering. This dissertation designs, builds, and evaluates Retail Sentiment Intelligence (RSI), a complete offline-first prototype that converts a noisy public Reddit stream into a structured, aspect-tagged, trust-weighted brand-health feed. Posts from 25 curated retail communities are ingested, de-duplicated, and assigned a 0–1 trust score combining metadata heuristics, near-duplicate detection, and credibility checks. Trusted posts are classified for sentiment by a domain fine-tuned ModernBERT encoder, tagged with aspects by a zero-shot NLI classifier over an eight-category taxonomy, and — when an image is attached — captioned by a multi-pass, anti-hallucination Gemma 3 4B pipeline. Sentiment macro-F1 improved from 0.6272 to 0.7642 (and 0.28 to 1.00 on long posts); vision hallucination fell from 50% to 0%. A React/FastAPI dashboard surfaces results across eight surfaces including a live alert feed, a human-in-the-loop review queue, a post-lifecycle board, and competitor insights. The report documents the full lifecycle: literature survey, design, implementation, honest cross-validated evaluation, limitations, and recommendations.</w:t>
+        <w:t>Public social media is now a primary real-time channel for retail customer voice, yet fake and low-credibility posts contaminate any aggregate consumed without filtering. This dissertation designs, builds, and evaluates Retail Sentiment Intelligence (RSI), a complete offline-first prototype that converts a noisy public Reddit stream into a structured, aspect-tagged, trust-weighted brand-health feed. Posts from 25 curated retail communities are ingested, de-duplicated, and assigned a 0–1 trust score combining metadata heuristics, near-duplicate detection, and credibility checks. Trusted posts are classified for sentiment by a domain fine-tuned ModernBERT encoder, tagged with aspects by a zero-shot NLI classifier over an eight-category taxonomy, and — when an image is attached — captioned by a multi-pass, anti-hallucination Gemma 3 4B pipeline. Sentiment macro-F1 improved from 0.6272 to 0.7642 (and 5/7 to 7/7 correct on ≥512-tok long posts); vision hallucination fell from 50% to 0%. A React/FastAPI dashboard surfaces results across eight surfaces including a live alert feed, a human-in-the-loop review queue, a post-lifecycle board, and competitor insights. The report documents the full lifecycle: literature survey, design, implementation, honest cross-validated evaluation, limitations, and recommendations.</w:t>
       </w:r>
     </w:p>
     <w:p>
@@ -6616,7 +6616,7 @@
       <w:r>
         <w:drawing>
           <wp:inline xmlns:a="http://schemas.openxmlformats.org/drawingml/2006/main" xmlns:pic="http://schemas.openxmlformats.org/drawingml/2006/picture">
-            <wp:extent cx="5120640" cy="2784537"/>
+            <wp:extent cx="5120640" cy="2422264"/>
             <wp:docPr id="14" name="Picture 14"/>
             <wp:cNvGraphicFramePr>
               <a:graphicFrameLocks noChangeAspect="1"/>
@@ -6637,7 +6637,7 @@
                   <pic:spPr>
                     <a:xfrm>
                       <a:off x="0" y="0"/>
-                      <a:ext cx="5120640" cy="2784537"/>
+                      <a:ext cx="5120640" cy="2422264"/>
                     </a:xfrm>
                     <a:prstGeom prst="rect"/>
                   </pic:spPr>

</xml_diff>